<commit_message>
Verify lab 2 in StarUML and replace report figures with GUI screenshots
</commit_message>
<xml_diff>
--- a/lab2_workshop/Отчет_ЛР2_Мастерская.docx
+++ b/lab2_workshop/Отчет_ЛР2_Мастерская.docx
@@ -1181,6 +1181,15 @@
     </w:p>
     <w:p>
       <w:pPr>
+        <w:pStyle w:val="ReportBody"/>
+        <w:keepNext w:val="0"/>
+      </w:pPr>
+      <w:r>
+        <w:t>Диаграммы открыты, проверены и сохранены в StarUML 7.1.1. На рисунках 1–3 приведены настоящие снимки окна программы; редактируемые проекты и экспорт диаграмм приложены отдельно.</w:t>
+      </w:r>
+    </w:p>
+    <w:p>
+      <w:pPr>
         <w:pStyle w:val="ReportHeading1"/>
         <w:keepNext/>
       </w:pPr>
@@ -1236,7 +1245,7 @@
       <w:r>
         <w:drawing>
           <wp:inline xmlns:a="http://schemas.openxmlformats.org/drawingml/2006/main" xmlns:pic="http://schemas.openxmlformats.org/drawingml/2006/picture">
-            <wp:extent cx="5868000" cy="7735091"/>
+            <wp:extent cx="5868000" cy="6031000"/>
             <wp:docPr id="1" name="Picture 1"/>
             <wp:cNvGraphicFramePr>
               <a:graphicFrameLocks noChangeAspect="1"/>
@@ -1245,7 +1254,7 @@
               <a:graphicData uri="http://schemas.openxmlformats.org/drawingml/2006/picture">
                 <pic:pic>
                   <pic:nvPicPr>
-                    <pic:cNvPr id="0" name="01_states.png"/>
+                    <pic:cNvPr id="0" name="01_states_staruml.png"/>
                     <pic:cNvPicPr/>
                   </pic:nvPicPr>
                   <pic:blipFill>
@@ -1257,7 +1266,7 @@
                   <pic:spPr>
                     <a:xfrm>
                       <a:off x="0" y="0"/>
-                      <a:ext cx="5868000" cy="7735091"/>
+                      <a:ext cx="5868000" cy="6031000"/>
                     </a:xfrm>
                     <a:prstGeom prst="rect"/>
                   </pic:spPr>
@@ -1278,7 +1287,7 @@
           <w:rFonts w:ascii="Times New Roman" w:hAnsi="Times New Roman"/>
           <w:sz w:val="22"/>
         </w:rPr>
-        <w:t>Рисунок 1 – Диаграмма состояний объекта «Заказ на ремонт»</w:t>
+        <w:t>Рисунок 1 – StarUML: состояния объекта «Заказ на ремонт»</w:t>
       </w:r>
     </w:p>
     <w:p>
@@ -1352,7 +1361,7 @@
       <w:r>
         <w:drawing>
           <wp:inline xmlns:a="http://schemas.openxmlformats.org/drawingml/2006/main" xmlns:pic="http://schemas.openxmlformats.org/drawingml/2006/picture">
-            <wp:extent cx="5760000" cy="8011636"/>
+            <wp:extent cx="5760000" cy="5920000"/>
             <wp:docPr id="2" name="Picture 2"/>
             <wp:cNvGraphicFramePr>
               <a:graphicFrameLocks noChangeAspect="1"/>
@@ -1361,7 +1370,7 @@
               <a:graphicData uri="http://schemas.openxmlformats.org/drawingml/2006/picture">
                 <pic:pic>
                   <pic:nvPicPr>
-                    <pic:cNvPr id="0" name="02_application.png"/>
+                    <pic:cNvPr id="0" name="02_application_staruml.png"/>
                     <pic:cNvPicPr/>
                   </pic:nvPicPr>
                   <pic:blipFill>
@@ -1373,7 +1382,7 @@
                   <pic:spPr>
                     <a:xfrm>
                       <a:off x="0" y="0"/>
-                      <a:ext cx="5760000" cy="8011636"/>
+                      <a:ext cx="5760000" cy="5920000"/>
                     </a:xfrm>
                     <a:prstGeom prst="rect"/>
                   </pic:spPr>
@@ -1394,7 +1403,7 @@
           <w:rFonts w:ascii="Times New Roman" w:hAnsi="Times New Roman"/>
           <w:sz w:val="22"/>
         </w:rPr>
-        <w:t>Рисунок 2 – Оформление заявки на ремонт с выделением сущностей</w:t>
+        <w:t>Рисунок 2 – StarUML: оформление заявки на ремонт с выделением сущностей</w:t>
       </w:r>
     </w:p>
     <w:p>
@@ -1468,7 +1477,7 @@
       <w:r>
         <w:drawing>
           <wp:inline xmlns:a="http://schemas.openxmlformats.org/drawingml/2006/main" xmlns:pic="http://schemas.openxmlformats.org/drawingml/2006/picture">
-            <wp:extent cx="6120000" cy="7012500"/>
+            <wp:extent cx="6120000" cy="6290000"/>
             <wp:docPr id="3" name="Picture 3"/>
             <wp:cNvGraphicFramePr>
               <a:graphicFrameLocks noChangeAspect="1"/>
@@ -1477,7 +1486,7 @@
               <a:graphicData uri="http://schemas.openxmlformats.org/drawingml/2006/picture">
                 <pic:pic>
                   <pic:nvPicPr>
-                    <pic:cNvPr id="0" name="03_diagnosis.png"/>
+                    <pic:cNvPr id="0" name="03_diagnosis_staruml.png"/>
                     <pic:cNvPicPr/>
                   </pic:nvPicPr>
                   <pic:blipFill>
@@ -1489,7 +1498,7 @@
                   <pic:spPr>
                     <a:xfrm>
                       <a:off x="0" y="0"/>
-                      <a:ext cx="6120000" cy="7012500"/>
+                      <a:ext cx="6120000" cy="6290000"/>
                     </a:xfrm>
                     <a:prstGeom prst="rect"/>
                   </pic:spPr>
@@ -1510,7 +1519,7 @@
           <w:rFonts w:ascii="Times New Roman" w:hAnsi="Times New Roman"/>
           <w:sz w:val="22"/>
         </w:rPr>
-        <w:t>Рисунок 3 – Диагностика и согласование стоимости с дорожками</w:t>
+        <w:t>Рисунок 3 – StarUML: диагностика и согласование стоимости с дорожками</w:t>
       </w:r>
     </w:p>
     <w:p>

</xml_diff>